<commit_message>
Sync downloadable program docx with updated schedule
</commit_message>
<xml_diff>
--- a/arbat-astana-art-fest-program.docx
+++ b/arbat-astana-art-fest-program.docx
@@ -63,12 +63,12 @@
       </w:pPr>
       <w:r>
         <w:rPr>
-          <w:i/>
-          <w:color w:val="5B6B84"/>
+          <w:b/>
+          <w:color w:val="C93F63"/>
           <w:sz w:val="18"/>
           <w:szCs w:val="18"/>
         </w:rPr>
-        <w:t xml:space="preserve">Программа на 18 и 19 июля одинаковая</w:t>
+        <w:t xml:space="preserve">18 ИЮЛЯ</w:t>
       </w:r>
     </w:p>
     <w:tbl>
@@ -143,6 +143,629 @@
                 <w:szCs w:val="18"/>
               </w:rPr>
               <w:t xml:space="preserve">Выступление</w:t>
+            </w:r>
+          </w:p>
+        </w:tc>
+      </w:tr>
+      <w:tr>
+        <w:tc>
+          <w:tcPr>
+            <w:tcW w:w="1600" w:type="dxa"/>
+            <w:tcMar>
+              <w:top w:w="60" w:type="dxa"/>
+              <w:bottom w:w="60" w:type="dxa"/>
+              <w:left w:w="100" w:type="dxa"/>
+              <w:right w:w="100" w:type="dxa"/>
+            </w:tcMar>
+            <w:vAlign w:val="center"/>
+          </w:tcPr>
+          <w:p>
+            <w:pPr>
+              <w:spacing w:after="0"/>
+            </w:pPr>
+            <w:r>
+              <w:rPr>
+                <w:b/>
+                <w:color w:val="0090AC"/>
+                <w:sz w:val="18"/>
+                <w:szCs w:val="18"/>
+              </w:rPr>
+              <w:t xml:space="preserve">18:00-18:30</w:t>
+            </w:r>
+          </w:p>
+        </w:tc>
+        <w:tc>
+          <w:tcPr>
+            <w:tcW w:w="8866" w:type="dxa"/>
+            <w:tcMar>
+              <w:top w:w="60" w:type="dxa"/>
+              <w:bottom w:w="60" w:type="dxa"/>
+              <w:left w:w="100" w:type="dxa"/>
+              <w:right w:w="100" w:type="dxa"/>
+            </w:tcMar>
+            <w:vAlign w:val="center"/>
+          </w:tcPr>
+          <w:p>
+            <w:pPr>
+              <w:spacing w:after="0"/>
+            </w:pPr>
+            <w:r>
+              <w:rPr>
+                <w:sz w:val="18"/>
+                <w:szCs w:val="18"/>
+              </w:rPr>
+              <w:t xml:space="preserve">Хор флейт (Ансамбль флейт им. К. Жумакенова)</w:t>
+            </w:r>
+          </w:p>
+        </w:tc>
+      </w:tr>
+      <w:tr>
+        <w:tc>
+          <w:tcPr>
+            <w:tcW w:w="1600" w:type="dxa"/>
+            <w:tcMar>
+              <w:top w:w="60" w:type="dxa"/>
+              <w:bottom w:w="60" w:type="dxa"/>
+              <w:left w:w="100" w:type="dxa"/>
+              <w:right w:w="100" w:type="dxa"/>
+            </w:tcMar>
+            <w:vAlign w:val="center"/>
+          </w:tcPr>
+          <w:p>
+            <w:pPr>
+              <w:spacing w:after="0"/>
+            </w:pPr>
+            <w:r>
+              <w:rPr>
+                <w:b/>
+                <w:color w:val="0090AC"/>
+                <w:sz w:val="18"/>
+                <w:szCs w:val="18"/>
+              </w:rPr>
+              <w:t xml:space="preserve">18:30-19:00</w:t>
+            </w:r>
+          </w:p>
+        </w:tc>
+        <w:tc>
+          <w:tcPr>
+            <w:tcW w:w="8866" w:type="dxa"/>
+            <w:tcMar>
+              <w:top w:w="60" w:type="dxa"/>
+              <w:bottom w:w="60" w:type="dxa"/>
+              <w:left w:w="100" w:type="dxa"/>
+              <w:right w:w="100" w:type="dxa"/>
+            </w:tcMar>
+            <w:vAlign w:val="center"/>
+          </w:tcPr>
+          <w:p>
+            <w:pPr>
+              <w:spacing w:after="0"/>
+            </w:pPr>
+            <w:r>
+              <w:rPr>
+                <w:sz w:val="18"/>
+                <w:szCs w:val="18"/>
+              </w:rPr>
+              <w:t xml:space="preserve">Хоровая музыка (рук. Батыржан Смаков)</w:t>
+            </w:r>
+          </w:p>
+        </w:tc>
+      </w:tr>
+      <w:tr>
+        <w:tc>
+          <w:tcPr>
+            <w:tcW w:w="1600" w:type="dxa"/>
+            <w:tcMar>
+              <w:top w:w="60" w:type="dxa"/>
+              <w:bottom w:w="60" w:type="dxa"/>
+              <w:left w:w="100" w:type="dxa"/>
+              <w:right w:w="100" w:type="dxa"/>
+            </w:tcMar>
+            <w:vAlign w:val="center"/>
+          </w:tcPr>
+          <w:p>
+            <w:pPr>
+              <w:spacing w:after="0"/>
+            </w:pPr>
+            <w:r>
+              <w:rPr>
+                <w:b/>
+                <w:color w:val="0090AC"/>
+                <w:sz w:val="18"/>
+                <w:szCs w:val="18"/>
+              </w:rPr>
+              <w:t xml:space="preserve">19:00-19:20</w:t>
+            </w:r>
+          </w:p>
+        </w:tc>
+        <w:tc>
+          <w:tcPr>
+            <w:tcW w:w="8866" w:type="dxa"/>
+            <w:tcMar>
+              <w:top w:w="60" w:type="dxa"/>
+              <w:bottom w:w="60" w:type="dxa"/>
+              <w:left w:w="100" w:type="dxa"/>
+              <w:right w:w="100" w:type="dxa"/>
+            </w:tcMar>
+            <w:vAlign w:val="center"/>
+          </w:tcPr>
+          <w:p>
+            <w:pPr>
+              <w:spacing w:after="0"/>
+            </w:pPr>
+            <w:r>
+              <w:rPr>
+                <w:sz w:val="18"/>
+                <w:szCs w:val="18"/>
+              </w:rPr>
+              <w:t xml:space="preserve">Олжас Сулейменов - Домбра</w:t>
+            </w:r>
+          </w:p>
+        </w:tc>
+      </w:tr>
+      <w:tr>
+        <w:tc>
+          <w:tcPr>
+            <w:tcW w:w="1600" w:type="dxa"/>
+            <w:tcMar>
+              <w:top w:w="60" w:type="dxa"/>
+              <w:bottom w:w="60" w:type="dxa"/>
+              <w:left w:w="100" w:type="dxa"/>
+              <w:right w:w="100" w:type="dxa"/>
+            </w:tcMar>
+            <w:vAlign w:val="center"/>
+          </w:tcPr>
+          <w:p>
+            <w:pPr>
+              <w:spacing w:after="0"/>
+            </w:pPr>
+            <w:r>
+              <w:rPr>
+                <w:b/>
+                <w:color w:val="0090AC"/>
+                <w:sz w:val="18"/>
+                <w:szCs w:val="18"/>
+              </w:rPr>
+              <w:t xml:space="preserve">19:20-19:30</w:t>
+            </w:r>
+          </w:p>
+        </w:tc>
+        <w:tc>
+          <w:tcPr>
+            <w:tcW w:w="8866" w:type="dxa"/>
+            <w:tcMar>
+              <w:top w:w="60" w:type="dxa"/>
+              <w:bottom w:w="60" w:type="dxa"/>
+              <w:left w:w="100" w:type="dxa"/>
+              <w:right w:w="100" w:type="dxa"/>
+            </w:tcMar>
+            <w:vAlign w:val="center"/>
+          </w:tcPr>
+          <w:p>
+            <w:pPr>
+              <w:spacing w:after="0"/>
+            </w:pPr>
+            <w:r>
+              <w:rPr>
+                <w:sz w:val="18"/>
+                <w:szCs w:val="18"/>
+              </w:rPr>
+              <w:t xml:space="preserve">Талгат Бердигулов - Волынка</w:t>
+            </w:r>
+          </w:p>
+        </w:tc>
+      </w:tr>
+      <w:tr>
+        <w:tc>
+          <w:tcPr>
+            <w:tcW w:w="1600" w:type="dxa"/>
+            <w:tcMar>
+              <w:top w:w="60" w:type="dxa"/>
+              <w:bottom w:w="60" w:type="dxa"/>
+              <w:left w:w="100" w:type="dxa"/>
+              <w:right w:w="100" w:type="dxa"/>
+            </w:tcMar>
+            <w:vAlign w:val="center"/>
+          </w:tcPr>
+          <w:p>
+            <w:pPr>
+              <w:spacing w:after="0"/>
+            </w:pPr>
+            <w:r>
+              <w:rPr>
+                <w:b/>
+                <w:color w:val="0090AC"/>
+                <w:sz w:val="18"/>
+                <w:szCs w:val="18"/>
+              </w:rPr>
+              <w:t xml:space="preserve">19:30-20:30</w:t>
+            </w:r>
+          </w:p>
+        </w:tc>
+        <w:tc>
+          <w:tcPr>
+            <w:tcW w:w="8866" w:type="dxa"/>
+            <w:tcMar>
+              <w:top w:w="60" w:type="dxa"/>
+              <w:bottom w:w="60" w:type="dxa"/>
+              <w:left w:w="100" w:type="dxa"/>
+              <w:right w:w="100" w:type="dxa"/>
+            </w:tcMar>
+            <w:vAlign w:val="center"/>
+          </w:tcPr>
+          <w:p>
+            <w:pPr>
+              <w:spacing w:after="0"/>
+            </w:pPr>
+            <w:r>
+              <w:rPr>
+                <w:sz w:val="18"/>
+                <w:szCs w:val="18"/>
+              </w:rPr>
+              <w:t xml:space="preserve">Лилия Долдырина - Поэзия и французские песни</w:t>
+            </w:r>
+          </w:p>
+        </w:tc>
+      </w:tr>
+      <w:tr>
+        <w:tc>
+          <w:tcPr>
+            <w:tcW w:w="1600" w:type="dxa"/>
+            <w:tcMar>
+              <w:top w:w="60" w:type="dxa"/>
+              <w:bottom w:w="60" w:type="dxa"/>
+              <w:left w:w="100" w:type="dxa"/>
+              <w:right w:w="100" w:type="dxa"/>
+            </w:tcMar>
+            <w:vAlign w:val="center"/>
+          </w:tcPr>
+          <w:p>
+            <w:pPr>
+              <w:spacing w:after="0"/>
+            </w:pPr>
+            <w:r>
+              <w:rPr>
+                <w:b/>
+                <w:color w:val="0090AC"/>
+                <w:sz w:val="18"/>
+                <w:szCs w:val="18"/>
+              </w:rPr>
+              <w:t xml:space="preserve">20:30-20:45</w:t>
+            </w:r>
+          </w:p>
+        </w:tc>
+        <w:tc>
+          <w:tcPr>
+            <w:tcW w:w="8866" w:type="dxa"/>
+            <w:tcMar>
+              <w:top w:w="60" w:type="dxa"/>
+              <w:bottom w:w="60" w:type="dxa"/>
+              <w:left w:w="100" w:type="dxa"/>
+              <w:right w:w="100" w:type="dxa"/>
+            </w:tcMar>
+            <w:vAlign w:val="center"/>
+          </w:tcPr>
+          <w:p>
+            <w:pPr>
+              <w:spacing w:after="0"/>
+            </w:pPr>
+            <w:r>
+              <w:rPr>
+                <w:sz w:val="18"/>
+                <w:szCs w:val="18"/>
+              </w:rPr>
+              <w:t xml:space="preserve">Султан Рахимжанов - Рэп-выступление</w:t>
+            </w:r>
+          </w:p>
+        </w:tc>
+      </w:tr>
+      <w:tr>
+        <w:tc>
+          <w:tcPr>
+            <w:tcW w:w="1600" w:type="dxa"/>
+            <w:tcMar>
+              <w:top w:w="60" w:type="dxa"/>
+              <w:bottom w:w="60" w:type="dxa"/>
+              <w:left w:w="100" w:type="dxa"/>
+              <w:right w:w="100" w:type="dxa"/>
+            </w:tcMar>
+            <w:vAlign w:val="center"/>
+          </w:tcPr>
+          <w:p>
+            <w:pPr>
+              <w:spacing w:after="0"/>
+            </w:pPr>
+            <w:r>
+              <w:rPr>
+                <w:b/>
+                <w:color w:val="0090AC"/>
+                <w:sz w:val="18"/>
+                <w:szCs w:val="18"/>
+              </w:rPr>
+              <w:t xml:space="preserve">20:45-21:15</w:t>
+            </w:r>
+          </w:p>
+        </w:tc>
+        <w:tc>
+          <w:tcPr>
+            <w:tcW w:w="8866" w:type="dxa"/>
+            <w:tcMar>
+              <w:top w:w="60" w:type="dxa"/>
+              <w:bottom w:w="60" w:type="dxa"/>
+              <w:left w:w="100" w:type="dxa"/>
+              <w:right w:w="100" w:type="dxa"/>
+            </w:tcMar>
+            <w:vAlign w:val="center"/>
+          </w:tcPr>
+          <w:p>
+            <w:pPr>
+              <w:spacing w:after="0"/>
+            </w:pPr>
+            <w:r>
+              <w:rPr>
+                <w:sz w:val="18"/>
+                <w:szCs w:val="18"/>
+              </w:rPr>
+              <w:t xml:space="preserve">Лекция о саундтреках - Sezim Music Show</w:t>
+            </w:r>
+          </w:p>
+        </w:tc>
+      </w:tr>
+      <w:tr>
+        <w:tc>
+          <w:tcPr>
+            <w:tcW w:w="1600" w:type="dxa"/>
+            <w:tcMar>
+              <w:top w:w="60" w:type="dxa"/>
+              <w:bottom w:w="60" w:type="dxa"/>
+              <w:left w:w="100" w:type="dxa"/>
+              <w:right w:w="100" w:type="dxa"/>
+            </w:tcMar>
+            <w:vAlign w:val="center"/>
+          </w:tcPr>
+          <w:p>
+            <w:pPr>
+              <w:spacing w:after="0"/>
+            </w:pPr>
+            <w:r>
+              <w:rPr>
+                <w:b/>
+                <w:color w:val="0090AC"/>
+                <w:sz w:val="18"/>
+                <w:szCs w:val="18"/>
+              </w:rPr>
+              <w:t xml:space="preserve">21:15-22:30</w:t>
+            </w:r>
+          </w:p>
+        </w:tc>
+        <w:tc>
+          <w:tcPr>
+            <w:tcW w:w="8866" w:type="dxa"/>
+            <w:tcMar>
+              <w:top w:w="60" w:type="dxa"/>
+              <w:bottom w:w="60" w:type="dxa"/>
+              <w:left w:w="100" w:type="dxa"/>
+              <w:right w:w="100" w:type="dxa"/>
+            </w:tcMar>
+            <w:vAlign w:val="center"/>
+          </w:tcPr>
+          <w:p>
+            <w:pPr>
+              <w:spacing w:after="0"/>
+            </w:pPr>
+            <w:r>
+              <w:rPr>
+                <w:sz w:val="18"/>
+                <w:szCs w:val="18"/>
+              </w:rPr>
+              <w:t xml:space="preserve">Концерт - Sezim Music Show</w:t>
+            </w:r>
+          </w:p>
+        </w:tc>
+      </w:tr>
+      <w:tr>
+        <w:tc>
+          <w:tcPr>
+            <w:tcW w:w="1600" w:type="dxa"/>
+            <w:tcMar>
+              <w:top w:w="60" w:type="dxa"/>
+              <w:bottom w:w="60" w:type="dxa"/>
+              <w:left w:w="100" w:type="dxa"/>
+              <w:right w:w="100" w:type="dxa"/>
+            </w:tcMar>
+            <w:vAlign w:val="center"/>
+          </w:tcPr>
+          <w:p>
+            <w:pPr>
+              <w:spacing w:after="0"/>
+            </w:pPr>
+            <w:r>
+              <w:rPr>
+                <w:b/>
+                <w:color w:val="0090AC"/>
+                <w:sz w:val="18"/>
+                <w:szCs w:val="18"/>
+              </w:rPr>
+              <w:t xml:space="preserve">22:30-22:40</w:t>
+            </w:r>
+          </w:p>
+        </w:tc>
+        <w:tc>
+          <w:tcPr>
+            <w:tcW w:w="8866" w:type="dxa"/>
+            <w:tcMar>
+              <w:top w:w="60" w:type="dxa"/>
+              <w:bottom w:w="60" w:type="dxa"/>
+              <w:left w:w="100" w:type="dxa"/>
+              <w:right w:w="100" w:type="dxa"/>
+            </w:tcMar>
+            <w:vAlign w:val="center"/>
+          </w:tcPr>
+          <w:p>
+            <w:pPr>
+              <w:spacing w:after="0"/>
+            </w:pPr>
+            <w:r>
+              <w:rPr>
+                <w:sz w:val="18"/>
+                <w:szCs w:val="18"/>
+              </w:rPr>
+              <w:t xml:space="preserve">Показ фильма - Сабира Пашкевич</w:t>
+            </w:r>
+          </w:p>
+        </w:tc>
+      </w:tr>
+    </w:tbl>
+    <w:p>
+      <w:pPr>
+        <w:spacing w:after="240"/>
+      </w:pPr>
+      <w:r>
+        <w:rPr>
+          <w:sz w:val="8"/>
+          <w:szCs w:val="8"/>
+        </w:rPr>
+        <w:t xml:space="preserve"/>
+      </w:r>
+    </w:p>
+    <w:p>
+      <w:pPr>
+        <w:spacing w:after="160"/>
+      </w:pPr>
+      <w:r>
+        <w:rPr>
+          <w:b/>
+          <w:color w:val="C93F63"/>
+          <w:sz w:val="18"/>
+          <w:szCs w:val="18"/>
+        </w:rPr>
+        <w:t xml:space="preserve">19 ИЮЛЯ</w:t>
+      </w:r>
+    </w:p>
+    <w:tbl>
+      <w:tblPr>
+        <w:tblW w:w="10466" w:type="dxa"/>
+        <w:tblBorders>
+          <w:top w:val="single" w:sz="4" w:space="0" w:color="B9C4D0"/>
+          <w:left w:val="single" w:sz="4" w:space="0" w:color="B9C4D0"/>
+          <w:bottom w:val="single" w:sz="4" w:space="0" w:color="B9C4D0"/>
+          <w:right w:val="single" w:sz="4" w:space="0" w:color="B9C4D0"/>
+          <w:insideH w:val="single" w:sz="4" w:space="0" w:color="B9C4D0"/>
+          <w:insideV w:val="single" w:sz="4" w:space="0" w:color="B9C4D0"/>
+        </w:tblBorders>
+        <w:tblLayout w:type="fixed"/>
+      </w:tblPr>
+      <w:tblGrid>
+        <w:gridCol w:w="1600"/>
+        <w:gridCol w:w="8866"/>
+      </w:tblGrid>
+      <w:tr>
+        <w:trPr>
+          <w:tblHeader/>
+        </w:trPr>
+        <w:tc>
+          <w:tcPr>
+            <w:tcW w:w="1600" w:type="dxa"/>
+            <w:shd w:val="clear" w:color="auto" w:fill="DCEEF2"/>
+            <w:tcMar>
+              <w:top w:w="60" w:type="dxa"/>
+              <w:bottom w:w="60" w:type="dxa"/>
+              <w:left w:w="100" w:type="dxa"/>
+              <w:right w:w="100" w:type="dxa"/>
+            </w:tcMar>
+            <w:vAlign w:val="center"/>
+          </w:tcPr>
+          <w:p>
+            <w:pPr>
+              <w:spacing w:after="0"/>
+            </w:pPr>
+            <w:r>
+              <w:rPr>
+                <w:b/>
+                <w:color w:val="0A1E35"/>
+                <w:sz w:val="18"/>
+                <w:szCs w:val="18"/>
+              </w:rPr>
+              <w:t xml:space="preserve">Время</w:t>
+            </w:r>
+          </w:p>
+        </w:tc>
+        <w:tc>
+          <w:tcPr>
+            <w:tcW w:w="8866" w:type="dxa"/>
+            <w:shd w:val="clear" w:color="auto" w:fill="DCEEF2"/>
+            <w:tcMar>
+              <w:top w:w="60" w:type="dxa"/>
+              <w:bottom w:w="60" w:type="dxa"/>
+              <w:left w:w="100" w:type="dxa"/>
+              <w:right w:w="100" w:type="dxa"/>
+            </w:tcMar>
+            <w:vAlign w:val="center"/>
+          </w:tcPr>
+          <w:p>
+            <w:pPr>
+              <w:spacing w:after="0"/>
+            </w:pPr>
+            <w:r>
+              <w:rPr>
+                <w:b/>
+                <w:color w:val="0A1E35"/>
+                <w:sz w:val="18"/>
+                <w:szCs w:val="18"/>
+              </w:rPr>
+              <w:t xml:space="preserve">Выступление</w:t>
+            </w:r>
+          </w:p>
+        </w:tc>
+      </w:tr>
+      <w:tr>
+        <w:tc>
+          <w:tcPr>
+            <w:tcW w:w="1600" w:type="dxa"/>
+            <w:tcMar>
+              <w:top w:w="60" w:type="dxa"/>
+              <w:bottom w:w="60" w:type="dxa"/>
+              <w:left w:w="100" w:type="dxa"/>
+              <w:right w:w="100" w:type="dxa"/>
+            </w:tcMar>
+            <w:vAlign w:val="center"/>
+          </w:tcPr>
+          <w:p>
+            <w:pPr>
+              <w:spacing w:after="0"/>
+            </w:pPr>
+            <w:r>
+              <w:rPr>
+                <w:b/>
+                <w:color w:val="0090AC"/>
+                <w:sz w:val="18"/>
+                <w:szCs w:val="18"/>
+              </w:rPr>
+              <w:t xml:space="preserve">17:00-18:00</w:t>
+            </w:r>
+          </w:p>
+        </w:tc>
+        <w:tc>
+          <w:tcPr>
+            <w:tcW w:w="8866" w:type="dxa"/>
+            <w:tcMar>
+              <w:top w:w="60" w:type="dxa"/>
+              <w:bottom w:w="60" w:type="dxa"/>
+              <w:left w:w="100" w:type="dxa"/>
+              <w:right w:w="100" w:type="dxa"/>
+            </w:tcMar>
+            <w:vAlign w:val="center"/>
+          </w:tcPr>
+          <w:p>
+            <w:pPr>
+              <w:spacing w:after="0"/>
+            </w:pPr>
+            <w:r>
+              <w:rPr>
+                <w:sz w:val="18"/>
+                <w:szCs w:val="18"/>
+              </w:rPr>
+              <w:t xml:space="preserve">Культурный центр им. Свами Вивекананда</w:t>
             </w:r>
           </w:p>
         </w:tc>
@@ -807,629 +1430,6 @@
                 <w:sz w:val="18"/>
                 <w:szCs w:val="18"/>
               </w:rPr>
-              <w:t xml:space="preserve">18:00-18:30</w:t>
-            </w:r>
-          </w:p>
-        </w:tc>
-        <w:tc>
-          <w:tcPr>
-            <w:tcW w:w="8866" w:type="dxa"/>
-            <w:tcMar>
-              <w:top w:w="60" w:type="dxa"/>
-              <w:bottom w:w="60" w:type="dxa"/>
-              <w:left w:w="100" w:type="dxa"/>
-              <w:right w:w="100" w:type="dxa"/>
-            </w:tcMar>
-            <w:vAlign w:val="center"/>
-          </w:tcPr>
-          <w:p>
-            <w:pPr>
-              <w:spacing w:after="0"/>
-            </w:pPr>
-            <w:r>
-              <w:rPr>
-                <w:sz w:val="18"/>
-                <w:szCs w:val="18"/>
-              </w:rPr>
-              <w:t xml:space="preserve">Театр "Синтез" - Мухтар Дунгешов</w:t>
-            </w:r>
-          </w:p>
-        </w:tc>
-      </w:tr>
-      <w:tr>
-        <w:tc>
-          <w:tcPr>
-            <w:tcW w:w="1600" w:type="dxa"/>
-            <w:tcMar>
-              <w:top w:w="60" w:type="dxa"/>
-              <w:bottom w:w="60" w:type="dxa"/>
-              <w:left w:w="100" w:type="dxa"/>
-              <w:right w:w="100" w:type="dxa"/>
-            </w:tcMar>
-            <w:vAlign w:val="center"/>
-          </w:tcPr>
-          <w:p>
-            <w:pPr>
-              <w:spacing w:after="0"/>
-            </w:pPr>
-            <w:r>
-              <w:rPr>
-                <w:b/>
-                <w:color w:val="0090AC"/>
-                <w:sz w:val="18"/>
-                <w:szCs w:val="18"/>
-              </w:rPr>
-              <w:t xml:space="preserve">18:30-19:00</w:t>
-            </w:r>
-          </w:p>
-        </w:tc>
-        <w:tc>
-          <w:tcPr>
-            <w:tcW w:w="8866" w:type="dxa"/>
-            <w:tcMar>
-              <w:top w:w="60" w:type="dxa"/>
-              <w:bottom w:w="60" w:type="dxa"/>
-              <w:left w:w="100" w:type="dxa"/>
-              <w:right w:w="100" w:type="dxa"/>
-            </w:tcMar>
-            <w:vAlign w:val="center"/>
-          </w:tcPr>
-          <w:p>
-            <w:pPr>
-              <w:spacing w:after="0"/>
-            </w:pPr>
-            <w:r>
-              <w:rPr>
-                <w:sz w:val="18"/>
-                <w:szCs w:val="18"/>
-              </w:rPr>
-              <w:t xml:space="preserve">Жанали Кемельхаан</w:t>
-            </w:r>
-          </w:p>
-        </w:tc>
-      </w:tr>
-      <w:tr>
-        <w:tc>
-          <w:tcPr>
-            <w:tcW w:w="1600" w:type="dxa"/>
-            <w:tcMar>
-              <w:top w:w="60" w:type="dxa"/>
-              <w:bottom w:w="60" w:type="dxa"/>
-              <w:left w:w="100" w:type="dxa"/>
-              <w:right w:w="100" w:type="dxa"/>
-            </w:tcMar>
-            <w:vAlign w:val="center"/>
-          </w:tcPr>
-          <w:p>
-            <w:pPr>
-              <w:spacing w:after="0"/>
-            </w:pPr>
-            <w:r>
-              <w:rPr>
-                <w:b/>
-                <w:color w:val="0090AC"/>
-                <w:sz w:val="18"/>
-                <w:szCs w:val="18"/>
-              </w:rPr>
-              <w:t xml:space="preserve">19:00-19:30</w:t>
-            </w:r>
-          </w:p>
-        </w:tc>
-        <w:tc>
-          <w:tcPr>
-            <w:tcW w:w="8866" w:type="dxa"/>
-            <w:tcMar>
-              <w:top w:w="60" w:type="dxa"/>
-              <w:bottom w:w="60" w:type="dxa"/>
-              <w:left w:w="100" w:type="dxa"/>
-              <w:right w:w="100" w:type="dxa"/>
-            </w:tcMar>
-            <w:vAlign w:val="center"/>
-          </w:tcPr>
-          <w:p>
-            <w:pPr>
-              <w:spacing w:after="0"/>
-            </w:pPr>
-            <w:r>
-              <w:rPr>
-                <w:sz w:val="18"/>
-                <w:szCs w:val="18"/>
-              </w:rPr>
-              <w:t xml:space="preserve">Азия Бит (Марал Ками)</w:t>
-            </w:r>
-          </w:p>
-        </w:tc>
-      </w:tr>
-      <w:tr>
-        <w:tc>
-          <w:tcPr>
-            <w:tcW w:w="1600" w:type="dxa"/>
-            <w:tcMar>
-              <w:top w:w="60" w:type="dxa"/>
-              <w:bottom w:w="60" w:type="dxa"/>
-              <w:left w:w="100" w:type="dxa"/>
-              <w:right w:w="100" w:type="dxa"/>
-            </w:tcMar>
-            <w:vAlign w:val="center"/>
-          </w:tcPr>
-          <w:p>
-            <w:pPr>
-              <w:spacing w:after="0"/>
-            </w:pPr>
-            <w:r>
-              <w:rPr>
-                <w:b/>
-                <w:color w:val="0090AC"/>
-                <w:sz w:val="18"/>
-                <w:szCs w:val="18"/>
-              </w:rPr>
-              <w:t xml:space="preserve">19:30-20:30</w:t>
-            </w:r>
-          </w:p>
-        </w:tc>
-        <w:tc>
-          <w:tcPr>
-            <w:tcW w:w="8866" w:type="dxa"/>
-            <w:tcMar>
-              <w:top w:w="60" w:type="dxa"/>
-              <w:bottom w:w="60" w:type="dxa"/>
-              <w:left w:w="100" w:type="dxa"/>
-              <w:right w:w="100" w:type="dxa"/>
-            </w:tcMar>
-            <w:vAlign w:val="center"/>
-          </w:tcPr>
-          <w:p>
-            <w:pPr>
-              <w:spacing w:after="0"/>
-            </w:pPr>
-            <w:r>
-              <w:rPr>
-                <w:sz w:val="18"/>
-                <w:szCs w:val="18"/>
-              </w:rPr>
-              <w:t xml:space="preserve">Кося (Акнур Исхак, Madame Puteau)</w:t>
-            </w:r>
-          </w:p>
-        </w:tc>
-      </w:tr>
-      <w:tr>
-        <w:tc>
-          <w:tcPr>
-            <w:tcW w:w="1600" w:type="dxa"/>
-            <w:tcMar>
-              <w:top w:w="60" w:type="dxa"/>
-              <w:bottom w:w="60" w:type="dxa"/>
-              <w:left w:w="100" w:type="dxa"/>
-              <w:right w:w="100" w:type="dxa"/>
-            </w:tcMar>
-            <w:vAlign w:val="center"/>
-          </w:tcPr>
-          <w:p>
-            <w:pPr>
-              <w:spacing w:after="0"/>
-            </w:pPr>
-            <w:r>
-              <w:rPr>
-                <w:b/>
-                <w:color w:val="0090AC"/>
-                <w:sz w:val="18"/>
-                <w:szCs w:val="18"/>
-              </w:rPr>
-              <w:t xml:space="preserve">20:30-21:00</w:t>
-            </w:r>
-          </w:p>
-        </w:tc>
-        <w:tc>
-          <w:tcPr>
-            <w:tcW w:w="8866" w:type="dxa"/>
-            <w:tcMar>
-              <w:top w:w="60" w:type="dxa"/>
-              <w:bottom w:w="60" w:type="dxa"/>
-              <w:left w:w="100" w:type="dxa"/>
-              <w:right w:w="100" w:type="dxa"/>
-            </w:tcMar>
-            <w:vAlign w:val="center"/>
-          </w:tcPr>
-          <w:p>
-            <w:pPr>
-              <w:spacing w:after="0"/>
-            </w:pPr>
-            <w:r>
-              <w:rPr>
-                <w:sz w:val="18"/>
-                <w:szCs w:val="18"/>
-              </w:rPr>
-              <w:t xml:space="preserve">Данело (Danelo Live band)</w:t>
-            </w:r>
-          </w:p>
-        </w:tc>
-      </w:tr>
-      <w:tr>
-        <w:tc>
-          <w:tcPr>
-            <w:tcW w:w="1600" w:type="dxa"/>
-            <w:tcMar>
-              <w:top w:w="60" w:type="dxa"/>
-              <w:bottom w:w="60" w:type="dxa"/>
-              <w:left w:w="100" w:type="dxa"/>
-              <w:right w:w="100" w:type="dxa"/>
-            </w:tcMar>
-            <w:vAlign w:val="center"/>
-          </w:tcPr>
-          <w:p>
-            <w:pPr>
-              <w:spacing w:after="0"/>
-            </w:pPr>
-            <w:r>
-              <w:rPr>
-                <w:b/>
-                <w:color w:val="0090AC"/>
-                <w:sz w:val="18"/>
-                <w:szCs w:val="18"/>
-              </w:rPr>
-              <w:t xml:space="preserve">21:00-21:30</w:t>
-            </w:r>
-          </w:p>
-        </w:tc>
-        <w:tc>
-          <w:tcPr>
-            <w:tcW w:w="8866" w:type="dxa"/>
-            <w:tcMar>
-              <w:top w:w="60" w:type="dxa"/>
-              <w:bottom w:w="60" w:type="dxa"/>
-              <w:left w:w="100" w:type="dxa"/>
-              <w:right w:w="100" w:type="dxa"/>
-            </w:tcMar>
-            <w:vAlign w:val="center"/>
-          </w:tcPr>
-          <w:p>
-            <w:pPr>
-              <w:spacing w:after="0"/>
-            </w:pPr>
-            <w:r>
-              <w:rPr>
-                <w:sz w:val="18"/>
-                <w:szCs w:val="18"/>
-              </w:rPr>
-              <w:t xml:space="preserve">Мадина - Саксофон</w:t>
-            </w:r>
-          </w:p>
-        </w:tc>
-      </w:tr>
-      <w:tr>
-        <w:tc>
-          <w:tcPr>
-            <w:tcW w:w="1600" w:type="dxa"/>
-            <w:tcMar>
-              <w:top w:w="60" w:type="dxa"/>
-              <w:bottom w:w="60" w:type="dxa"/>
-              <w:left w:w="100" w:type="dxa"/>
-              <w:right w:w="100" w:type="dxa"/>
-            </w:tcMar>
-            <w:vAlign w:val="center"/>
-          </w:tcPr>
-          <w:p>
-            <w:pPr>
-              <w:spacing w:after="0"/>
-            </w:pPr>
-            <w:r>
-              <w:rPr>
-                <w:b/>
-                <w:color w:val="0090AC"/>
-                <w:sz w:val="18"/>
-                <w:szCs w:val="18"/>
-              </w:rPr>
-              <w:t xml:space="preserve">21:30-22:00</w:t>
-            </w:r>
-          </w:p>
-        </w:tc>
-        <w:tc>
-          <w:tcPr>
-            <w:tcW w:w="8866" w:type="dxa"/>
-            <w:tcMar>
-              <w:top w:w="60" w:type="dxa"/>
-              <w:bottom w:w="60" w:type="dxa"/>
-              <w:left w:w="100" w:type="dxa"/>
-              <w:right w:w="100" w:type="dxa"/>
-            </w:tcMar>
-            <w:vAlign w:val="center"/>
-          </w:tcPr>
-          <w:p>
-            <w:pPr>
-              <w:spacing w:after="0"/>
-            </w:pPr>
-            <w:r>
-              <w:rPr>
-                <w:sz w:val="18"/>
-                <w:szCs w:val="18"/>
-              </w:rPr>
-              <w:t xml:space="preserve">Мурат Асанаев - Гитара</w:t>
-            </w:r>
-          </w:p>
-        </w:tc>
-      </w:tr>
-      <w:tr>
-        <w:tc>
-          <w:tcPr>
-            <w:tcW w:w="1600" w:type="dxa"/>
-            <w:tcMar>
-              <w:top w:w="60" w:type="dxa"/>
-              <w:bottom w:w="60" w:type="dxa"/>
-              <w:left w:w="100" w:type="dxa"/>
-              <w:right w:w="100" w:type="dxa"/>
-            </w:tcMar>
-            <w:vAlign w:val="center"/>
-          </w:tcPr>
-          <w:p>
-            <w:pPr>
-              <w:spacing w:after="0"/>
-            </w:pPr>
-            <w:r>
-              <w:rPr>
-                <w:b/>
-                <w:color w:val="0090AC"/>
-                <w:sz w:val="18"/>
-                <w:szCs w:val="18"/>
-              </w:rPr>
-              <w:t xml:space="preserve">22:00-23:00</w:t>
-            </w:r>
-          </w:p>
-        </w:tc>
-        <w:tc>
-          <w:tcPr>
-            <w:tcW w:w="8866" w:type="dxa"/>
-            <w:tcMar>
-              <w:top w:w="60" w:type="dxa"/>
-              <w:bottom w:w="60" w:type="dxa"/>
-              <w:left w:w="100" w:type="dxa"/>
-              <w:right w:w="100" w:type="dxa"/>
-            </w:tcMar>
-            <w:vAlign w:val="center"/>
-          </w:tcPr>
-          <w:p>
-            <w:pPr>
-              <w:spacing w:after="0"/>
-            </w:pPr>
-            <w:r>
-              <w:rPr>
-                <w:sz w:val="18"/>
-                <w:szCs w:val="18"/>
-              </w:rPr>
-              <w:t xml:space="preserve">Открытый микрофон</w:t>
-            </w:r>
-          </w:p>
-        </w:tc>
-      </w:tr>
-    </w:tbl>
-    <w:p>
-      <w:pPr>
-        <w:spacing w:after="240"/>
-      </w:pPr>
-      <w:r>
-        <w:rPr>
-          <w:sz w:val="8"/>
-          <w:szCs w:val="8"/>
-        </w:rPr>
-        <w:t xml:space="preserve"/>
-      </w:r>
-    </w:p>
-    <w:p>
-      <w:pPr>
-        <w:spacing w:after="160"/>
-      </w:pPr>
-      <w:r>
-        <w:rPr>
-          <w:b/>
-          <w:color w:val="C93F63"/>
-          <w:sz w:val="18"/>
-          <w:szCs w:val="18"/>
-        </w:rPr>
-        <w:t xml:space="preserve">19 ИЮЛЯ (ВОСКРЕСЕНЬЕ)</w:t>
-      </w:r>
-    </w:p>
-    <w:tbl>
-      <w:tblPr>
-        <w:tblW w:w="10466" w:type="dxa"/>
-        <w:tblBorders>
-          <w:top w:val="single" w:sz="4" w:space="0" w:color="B9C4D0"/>
-          <w:left w:val="single" w:sz="4" w:space="0" w:color="B9C4D0"/>
-          <w:bottom w:val="single" w:sz="4" w:space="0" w:color="B9C4D0"/>
-          <w:right w:val="single" w:sz="4" w:space="0" w:color="B9C4D0"/>
-          <w:insideH w:val="single" w:sz="4" w:space="0" w:color="B9C4D0"/>
-          <w:insideV w:val="single" w:sz="4" w:space="0" w:color="B9C4D0"/>
-        </w:tblBorders>
-        <w:tblLayout w:type="fixed"/>
-      </w:tblPr>
-      <w:tblGrid>
-        <w:gridCol w:w="1600"/>
-        <w:gridCol w:w="8866"/>
-      </w:tblGrid>
-      <w:tr>
-        <w:trPr>
-          <w:tblHeader/>
-        </w:trPr>
-        <w:tc>
-          <w:tcPr>
-            <w:tcW w:w="1600" w:type="dxa"/>
-            <w:shd w:val="clear" w:color="auto" w:fill="DCEEF2"/>
-            <w:tcMar>
-              <w:top w:w="60" w:type="dxa"/>
-              <w:bottom w:w="60" w:type="dxa"/>
-              <w:left w:w="100" w:type="dxa"/>
-              <w:right w:w="100" w:type="dxa"/>
-            </w:tcMar>
-            <w:vAlign w:val="center"/>
-          </w:tcPr>
-          <w:p>
-            <w:pPr>
-              <w:spacing w:after="0"/>
-            </w:pPr>
-            <w:r>
-              <w:rPr>
-                <w:b/>
-                <w:color w:val="0A1E35"/>
-                <w:sz w:val="18"/>
-                <w:szCs w:val="18"/>
-              </w:rPr>
-              <w:t xml:space="preserve">Время</w:t>
-            </w:r>
-          </w:p>
-        </w:tc>
-        <w:tc>
-          <w:tcPr>
-            <w:tcW w:w="8866" w:type="dxa"/>
-            <w:shd w:val="clear" w:color="auto" w:fill="DCEEF2"/>
-            <w:tcMar>
-              <w:top w:w="60" w:type="dxa"/>
-              <w:bottom w:w="60" w:type="dxa"/>
-              <w:left w:w="100" w:type="dxa"/>
-              <w:right w:w="100" w:type="dxa"/>
-            </w:tcMar>
-            <w:vAlign w:val="center"/>
-          </w:tcPr>
-          <w:p>
-            <w:pPr>
-              <w:spacing w:after="0"/>
-            </w:pPr>
-            <w:r>
-              <w:rPr>
-                <w:b/>
-                <w:color w:val="0A1E35"/>
-                <w:sz w:val="18"/>
-                <w:szCs w:val="18"/>
-              </w:rPr>
-              <w:t xml:space="preserve">Выступление</w:t>
-            </w:r>
-          </w:p>
-        </w:tc>
-      </w:tr>
-      <w:tr>
-        <w:tc>
-          <w:tcPr>
-            <w:tcW w:w="1600" w:type="dxa"/>
-            <w:tcMar>
-              <w:top w:w="60" w:type="dxa"/>
-              <w:bottom w:w="60" w:type="dxa"/>
-              <w:left w:w="100" w:type="dxa"/>
-              <w:right w:w="100" w:type="dxa"/>
-            </w:tcMar>
-            <w:vAlign w:val="center"/>
-          </w:tcPr>
-          <w:p>
-            <w:pPr>
-              <w:spacing w:after="0"/>
-            </w:pPr>
-            <w:r>
-              <w:rPr>
-                <w:b/>
-                <w:color w:val="0090AC"/>
-                <w:sz w:val="18"/>
-                <w:szCs w:val="18"/>
-              </w:rPr>
-              <w:t xml:space="preserve">17:00-18:00</w:t>
-            </w:r>
-          </w:p>
-        </w:tc>
-        <w:tc>
-          <w:tcPr>
-            <w:tcW w:w="8866" w:type="dxa"/>
-            <w:tcMar>
-              <w:top w:w="60" w:type="dxa"/>
-              <w:bottom w:w="60" w:type="dxa"/>
-              <w:left w:w="100" w:type="dxa"/>
-              <w:right w:w="100" w:type="dxa"/>
-            </w:tcMar>
-            <w:vAlign w:val="center"/>
-          </w:tcPr>
-          <w:p>
-            <w:pPr>
-              <w:spacing w:after="0"/>
-            </w:pPr>
-            <w:r>
-              <w:rPr>
-                <w:sz w:val="18"/>
-                <w:szCs w:val="18"/>
-              </w:rPr>
-              <w:t xml:space="preserve">Дети "Улы Дала"</w:t>
-            </w:r>
-          </w:p>
-        </w:tc>
-      </w:tr>
-      <w:tr>
-        <w:tc>
-          <w:tcPr>
-            <w:tcW w:w="1600" w:type="dxa"/>
-            <w:tcMar>
-              <w:top w:w="60" w:type="dxa"/>
-              <w:bottom w:w="60" w:type="dxa"/>
-              <w:left w:w="100" w:type="dxa"/>
-              <w:right w:w="100" w:type="dxa"/>
-            </w:tcMar>
-            <w:vAlign w:val="center"/>
-          </w:tcPr>
-          <w:p>
-            <w:pPr>
-              <w:spacing w:after="0"/>
-            </w:pPr>
-            <w:r>
-              <w:rPr>
-                <w:b/>
-                <w:color w:val="0090AC"/>
-                <w:sz w:val="18"/>
-                <w:szCs w:val="18"/>
-              </w:rPr>
-              <w:t xml:space="preserve">18:00-18:30</w:t>
-            </w:r>
-          </w:p>
-        </w:tc>
-        <w:tc>
-          <w:tcPr>
-            <w:tcW w:w="8866" w:type="dxa"/>
-            <w:tcMar>
-              <w:top w:w="60" w:type="dxa"/>
-              <w:bottom w:w="60" w:type="dxa"/>
-              <w:left w:w="100" w:type="dxa"/>
-              <w:right w:w="100" w:type="dxa"/>
-            </w:tcMar>
-            <w:vAlign w:val="center"/>
-          </w:tcPr>
-          <w:p>
-            <w:pPr>
-              <w:spacing w:after="0"/>
-            </w:pPr>
-            <w:r>
-              <w:rPr>
-                <w:sz w:val="18"/>
-                <w:szCs w:val="18"/>
-              </w:rPr>
-              <w:t xml:space="preserve">Театр "Синтез" - Мухтар Дунгешов</w:t>
-            </w:r>
-          </w:p>
-        </w:tc>
-      </w:tr>
-      <w:tr>
-        <w:tc>
-          <w:tcPr>
-            <w:tcW w:w="1600" w:type="dxa"/>
-            <w:tcMar>
-              <w:top w:w="60" w:type="dxa"/>
-              <w:bottom w:w="60" w:type="dxa"/>
-              <w:left w:w="100" w:type="dxa"/>
-              <w:right w:w="100" w:type="dxa"/>
-            </w:tcMar>
-            <w:vAlign w:val="center"/>
-          </w:tcPr>
-          <w:p>
-            <w:pPr>
-              <w:spacing w:after="0"/>
-            </w:pPr>
-            <w:r>
-              <w:rPr>
-                <w:b/>
-                <w:color w:val="0090AC"/>
-                <w:sz w:val="18"/>
-                <w:szCs w:val="18"/>
-              </w:rPr>
               <w:t xml:space="preserve">18:30-19:00</w:t>
             </w:r>
           </w:p>
@@ -1897,59 +1897,59 @@
                 <w:sz w:val="18"/>
                 <w:szCs w:val="18"/>
               </w:rPr>
-              <w:t xml:space="preserve">17:00-18:00</w:t>
-            </w:r>
-          </w:p>
-        </w:tc>
-        <w:tc>
-          <w:tcPr>
-            <w:tcW w:w="8866" w:type="dxa"/>
-            <w:tcMar>
-              <w:top w:w="60" w:type="dxa"/>
-              <w:bottom w:w="60" w:type="dxa"/>
-              <w:left w:w="100" w:type="dxa"/>
-              <w:right w:w="100" w:type="dxa"/>
-            </w:tcMar>
-            <w:vAlign w:val="center"/>
-          </w:tcPr>
-          <w:p>
-            <w:pPr>
-              <w:spacing w:after="0"/>
-            </w:pPr>
-            <w:r>
-              <w:rPr>
-                <w:sz w:val="18"/>
-                <w:szCs w:val="18"/>
-              </w:rPr>
-              <w:t xml:space="preserve">Культурный центр им. Свами Вивекананда</w:t>
-            </w:r>
-          </w:p>
-        </w:tc>
-      </w:tr>
-      <w:tr>
-        <w:tc>
-          <w:tcPr>
-            <w:tcW w:w="1600" w:type="dxa"/>
-            <w:tcMar>
-              <w:top w:w="60" w:type="dxa"/>
-              <w:bottom w:w="60" w:type="dxa"/>
-              <w:left w:w="100" w:type="dxa"/>
-              <w:right w:w="100" w:type="dxa"/>
-            </w:tcMar>
-            <w:vAlign w:val="center"/>
-          </w:tcPr>
-          <w:p>
-            <w:pPr>
-              <w:spacing w:after="0"/>
-            </w:pPr>
-            <w:r>
-              <w:rPr>
-                <w:b/>
-                <w:color w:val="0090AC"/>
-                <w:sz w:val="18"/>
-                <w:szCs w:val="18"/>
-              </w:rPr>
-              <w:t xml:space="preserve">18:00-23:00</w:t>
+              <w:t xml:space="preserve">18:00-18:30</w:t>
+            </w:r>
+          </w:p>
+        </w:tc>
+        <w:tc>
+          <w:tcPr>
+            <w:tcW w:w="8866" w:type="dxa"/>
+            <w:tcMar>
+              <w:top w:w="60" w:type="dxa"/>
+              <w:bottom w:w="60" w:type="dxa"/>
+              <w:left w:w="100" w:type="dxa"/>
+              <w:right w:w="100" w:type="dxa"/>
+            </w:tcMar>
+            <w:vAlign w:val="center"/>
+          </w:tcPr>
+          <w:p>
+            <w:pPr>
+              <w:spacing w:after="0"/>
+            </w:pPr>
+            <w:r>
+              <w:rPr>
+                <w:sz w:val="18"/>
+                <w:szCs w:val="18"/>
+              </w:rPr>
+              <w:t xml:space="preserve">Театр "Синтез" - Мухтар Дунгешов</w:t>
+            </w:r>
+          </w:p>
+        </w:tc>
+      </w:tr>
+      <w:tr>
+        <w:tc>
+          <w:tcPr>
+            <w:tcW w:w="1600" w:type="dxa"/>
+            <w:tcMar>
+              <w:top w:w="60" w:type="dxa"/>
+              <w:bottom w:w="60" w:type="dxa"/>
+              <w:left w:w="100" w:type="dxa"/>
+              <w:right w:w="100" w:type="dxa"/>
+            </w:tcMar>
+            <w:vAlign w:val="center"/>
+          </w:tcPr>
+          <w:p>
+            <w:pPr>
+              <w:spacing w:after="0"/>
+            </w:pPr>
+            <w:r>
+              <w:rPr>
+                <w:b/>
+                <w:color w:val="0090AC"/>
+                <w:sz w:val="18"/>
+                <w:szCs w:val="18"/>
+              </w:rPr>
+              <w:t xml:space="preserve">18:30-23:00</w:t>
             </w:r>
           </w:p>
         </w:tc>

</xml_diff>